<commit_message>
borang 2 post seminar
</commit_message>
<xml_diff>
--- a/Administratif/Borang_2_Pendaftaran_Seminar_TA/28. [Form TA 10] BERITA ACARA SEMINAR.docx
+++ b/Administratif/Borang_2_Pendaftaran_Seminar_TA/28. [Form TA 10] BERITA ACARA SEMINAR.docx
@@ -108,7 +108,6 @@
         </w:rPr>
         <w:t xml:space="preserve">Hari </w:t>
       </w:r>
-      <w:proofErr w:type="spellStart"/>
       <w:r>
         <w:rPr>
           <w:rFonts w:cs="Calibri"/>
@@ -119,7 +118,6 @@
         </w:rPr>
         <w:t>ini</w:t>
       </w:r>
-      <w:proofErr w:type="spellEnd"/>
     </w:p>
     <w:p>
       <w:pPr>
@@ -176,6 +174,16 @@
         <w:tab/>
         <w:t>:</w:t>
       </w:r>
+      <w:r>
+        <w:rPr>
+          <w:rFonts w:cs="Calibri"/>
+          <w:color w:val="000000"/>
+          <w:sz w:val="20"/>
+          <w:szCs w:val="20"/>
+          <w:lang w:val="en-US"/>
+        </w:rPr>
+        <w:t xml:space="preserve"> Selasa/14 Juli 2020</w:t>
+      </w:r>
     </w:p>
     <w:p>
       <w:pPr>
@@ -232,6 +240,16 @@
         <w:tab/>
         <w:t>:</w:t>
       </w:r>
+      <w:r>
+        <w:rPr>
+          <w:rFonts w:cs="Calibri"/>
+          <w:color w:val="000000"/>
+          <w:sz w:val="20"/>
+          <w:szCs w:val="20"/>
+          <w:lang w:val="en-US"/>
+        </w:rPr>
+        <w:t xml:space="preserve"> Kondisional</w:t>
+      </w:r>
     </w:p>
     <w:p>
       <w:pPr>
@@ -277,7 +295,25 @@
           <w:lang w:val="en-US"/>
         </w:rPr>
         <w:tab/>
-        <w:t xml:space="preserve">: </w:t>
+        <w:t>:</w:t>
+      </w:r>
+      <w:r>
+        <w:rPr>
+          <w:rFonts w:cs="Calibri"/>
+          <w:sz w:val="20"/>
+          <w:szCs w:val="20"/>
+          <w:lang w:val="en-US"/>
+        </w:rPr>
+        <w:t xml:space="preserve"> 10.00 – 12.00 Wib</w:t>
+      </w:r>
+      <w:r>
+        <w:rPr>
+          <w:rFonts w:cs="Calibri"/>
+          <w:sz w:val="20"/>
+          <w:szCs w:val="20"/>
+          <w:lang w:val="en-US"/>
+        </w:rPr>
+        <w:t xml:space="preserve"> </w:t>
       </w:r>
     </w:p>
     <w:p>
@@ -320,6 +356,9 @@
     <w:p>
       <w:pPr>
         <w:widowControl w:val="0"/>
+        <w:tabs>
+          <w:tab w:val="left" w:pos="1418"/>
+        </w:tabs>
         <w:autoSpaceDE w:val="0"/>
         <w:autoSpaceDN w:val="0"/>
         <w:adjustRightInd w:val="0"/>
@@ -340,15 +379,14 @@
           <w:sz w:val="20"/>
           <w:szCs w:val="20"/>
         </w:rPr>
-        <w:t xml:space="preserve">Nama </w:t>
-      </w:r>
-      <w:r>
-        <w:rPr>
-          <w:rFonts w:cs="Calibri"/>
-          <w:color w:val="000000"/>
-          <w:sz w:val="20"/>
-          <w:szCs w:val="20"/>
-          <w:lang w:val="en-US"/>
+        <w:t>Nama</w:t>
+      </w:r>
+      <w:r>
+        <w:rPr>
+          <w:rFonts w:cs="Calibri"/>
+          <w:color w:val="000000"/>
+          <w:sz w:val="20"/>
+          <w:szCs w:val="20"/>
         </w:rPr>
         <w:tab/>
       </w:r>
@@ -360,17 +398,16 @@
           <w:szCs w:val="20"/>
           <w:lang w:val="en-US"/>
         </w:rPr>
-        <w:tab/>
-      </w:r>
-      <w:r>
-        <w:rPr>
-          <w:rFonts w:cs="Calibri"/>
-          <w:color w:val="000000"/>
-          <w:sz w:val="20"/>
-          <w:szCs w:val="20"/>
-          <w:lang w:val="en-US"/>
-        </w:rPr>
-        <w:tab/>
+        <w:t xml:space="preserve"> </w:t>
+      </w:r>
+      <w:r>
+        <w:rPr>
+          <w:rFonts w:cs="Calibri"/>
+          <w:color w:val="000000"/>
+          <w:sz w:val="20"/>
+          <w:szCs w:val="20"/>
+          <w:lang w:val="en-US"/>
+        </w:rPr>
         <w:t xml:space="preserve">: </w:t>
       </w:r>
       <w:r>
@@ -387,6 +424,9 @@
     <w:p>
       <w:pPr>
         <w:widowControl w:val="0"/>
+        <w:tabs>
+          <w:tab w:val="left" w:pos="1418"/>
+        </w:tabs>
         <w:autoSpaceDE w:val="0"/>
         <w:autoSpaceDN w:val="0"/>
         <w:adjustRightInd w:val="0"/>
@@ -400,7 +440,6 @@
           <w:lang w:val="en-US"/>
         </w:rPr>
       </w:pPr>
-      <w:proofErr w:type="spellStart"/>
       <w:r>
         <w:rPr>
           <w:rFonts w:cs="Calibri"/>
@@ -410,13 +449,23 @@
         </w:rPr>
         <w:t>Nim</w:t>
       </w:r>
-      <w:proofErr w:type="spellEnd"/>
-      <w:r>
-        <w:rPr>
-          <w:rFonts w:cs="Calibri"/>
-          <w:color w:val="000000"/>
-          <w:sz w:val="20"/>
-          <w:szCs w:val="20"/>
+      <w:r>
+        <w:rPr>
+          <w:rFonts w:cs="Calibri"/>
+          <w:color w:val="000000"/>
+          <w:sz w:val="20"/>
+          <w:szCs w:val="20"/>
+          <w:lang w:val="en-US"/>
+        </w:rPr>
+        <w:tab/>
+      </w:r>
+      <w:r>
+        <w:rPr>
+          <w:rFonts w:cs="Calibri"/>
+          <w:color w:val="000000"/>
+          <w:sz w:val="20"/>
+          <w:szCs w:val="20"/>
+          <w:lang w:val="en-US"/>
         </w:rPr>
         <w:t xml:space="preserve"> </w:t>
       </w:r>
@@ -428,27 +477,6 @@
           <w:szCs w:val="20"/>
           <w:lang w:val="en-US"/>
         </w:rPr>
-        <w:tab/>
-      </w:r>
-      <w:r>
-        <w:rPr>
-          <w:rFonts w:cs="Calibri"/>
-          <w:color w:val="000000"/>
-          <w:sz w:val="20"/>
-          <w:szCs w:val="20"/>
-          <w:lang w:val="en-US"/>
-        </w:rPr>
-        <w:tab/>
-      </w:r>
-      <w:r>
-        <w:rPr>
-          <w:rFonts w:cs="Calibri"/>
-          <w:color w:val="000000"/>
-          <w:sz w:val="20"/>
-          <w:szCs w:val="20"/>
-          <w:lang w:val="en-US"/>
-        </w:rPr>
-        <w:tab/>
         <w:t xml:space="preserve">: </w:t>
       </w:r>
       <w:r>
@@ -465,9 +493,13 @@
     <w:p>
       <w:pPr>
         <w:widowControl w:val="0"/>
+        <w:tabs>
+          <w:tab w:val="left" w:pos="1418"/>
+        </w:tabs>
         <w:autoSpaceDE w:val="0"/>
         <w:autoSpaceDN w:val="0"/>
         <w:adjustRightInd w:val="0"/>
+        <w:spacing w:after="0"/>
         <w:jc w:val="both"/>
         <w:rPr>
           <w:rFonts w:cs="Calibri"/>
@@ -477,18 +509,26 @@
           <w:lang w:val="en-US"/>
         </w:rPr>
       </w:pPr>
-      <w:proofErr w:type="spellStart"/>
-      <w:r>
-        <w:rPr>
-          <w:rFonts w:cs="Calibri"/>
-          <w:color w:val="000000"/>
-          <w:sz w:val="20"/>
-          <w:szCs w:val="20"/>
-          <w:lang w:val="en-US"/>
-        </w:rPr>
-        <w:t>Judul</w:t>
-      </w:r>
-      <w:proofErr w:type="spellEnd"/>
+      <w:r>
+        <w:rPr>
+          <w:rFonts w:cs="Calibri"/>
+          <w:color w:val="000000"/>
+          <w:sz w:val="20"/>
+          <w:szCs w:val="20"/>
+          <w:lang w:val="en-US"/>
+        </w:rPr>
+        <w:t>Judul Tugas Akhir</w:t>
+      </w:r>
+      <w:r>
+        <w:rPr>
+          <w:rFonts w:cs="Calibri"/>
+          <w:color w:val="000000"/>
+          <w:sz w:val="20"/>
+          <w:szCs w:val="20"/>
+          <w:lang w:val="en-US"/>
+        </w:rPr>
+        <w:tab/>
+      </w:r>
       <w:r>
         <w:rPr>
           <w:rFonts w:cs="Calibri"/>
@@ -498,48 +538,6 @@
           <w:lang w:val="en-US"/>
         </w:rPr>
         <w:t xml:space="preserve"> </w:t>
-      </w:r>
-      <w:proofErr w:type="spellStart"/>
-      <w:r>
-        <w:rPr>
-          <w:rFonts w:cs="Calibri"/>
-          <w:color w:val="000000"/>
-          <w:sz w:val="20"/>
-          <w:szCs w:val="20"/>
-          <w:lang w:val="en-US"/>
-        </w:rPr>
-        <w:t>Tugas</w:t>
-      </w:r>
-      <w:proofErr w:type="spellEnd"/>
-      <w:r>
-        <w:rPr>
-          <w:rFonts w:cs="Calibri"/>
-          <w:color w:val="000000"/>
-          <w:sz w:val="20"/>
-          <w:szCs w:val="20"/>
-          <w:lang w:val="en-US"/>
-        </w:rPr>
-        <w:t xml:space="preserve"> Akhir</w:t>
-      </w:r>
-      <w:r>
-        <w:rPr>
-          <w:rFonts w:cs="Calibri"/>
-          <w:color w:val="000000"/>
-          <w:sz w:val="20"/>
-          <w:szCs w:val="20"/>
-          <w:lang w:val="en-US"/>
-        </w:rPr>
-        <w:tab/>
-      </w:r>
-      <w:r>
-        <w:rPr>
-          <w:rFonts w:cs="Calibri"/>
-          <w:color w:val="000000"/>
-          <w:sz w:val="20"/>
-          <w:szCs w:val="20"/>
-          <w:lang w:val="en-US"/>
-        </w:rPr>
-        <w:tab/>
       </w:r>
       <w:r>
         <w:rPr>
@@ -571,139 +569,27 @@
           <w:szCs w:val="20"/>
           <w:lang w:val="en-US"/>
         </w:rPr>
+        <w:t xml:space="preserve"> Untuk Keamanan Sepeda Motor Berbasis Prosesor</w:t>
+      </w:r>
+      <w:r>
+        <w:rPr>
+          <w:rFonts w:cs="Calibri"/>
+          <w:color w:val="000000"/>
+          <w:sz w:val="20"/>
+          <w:szCs w:val="20"/>
+          <w:lang w:val="en-US"/>
+        </w:rPr>
         <w:t xml:space="preserve"> </w:t>
       </w:r>
-      <w:proofErr w:type="spellStart"/>
-      <w:r>
-        <w:rPr>
-          <w:rFonts w:cs="Calibri"/>
-          <w:color w:val="000000"/>
-          <w:sz w:val="20"/>
-          <w:szCs w:val="20"/>
-          <w:lang w:val="en-US"/>
-        </w:rPr>
-        <w:t>Untuk</w:t>
-      </w:r>
-      <w:proofErr w:type="spellEnd"/>
-      <w:r>
-        <w:rPr>
-          <w:rFonts w:cs="Calibri"/>
-          <w:color w:val="000000"/>
-          <w:sz w:val="20"/>
-          <w:szCs w:val="20"/>
-          <w:lang w:val="en-US"/>
-        </w:rPr>
-        <w:t xml:space="preserve"> </w:t>
-      </w:r>
-      <w:proofErr w:type="spellStart"/>
-      <w:r>
-        <w:rPr>
-          <w:rFonts w:cs="Calibri"/>
-          <w:color w:val="000000"/>
-          <w:sz w:val="20"/>
-          <w:szCs w:val="20"/>
-          <w:lang w:val="en-US"/>
-        </w:rPr>
-        <w:t>Keamanan</w:t>
-      </w:r>
-      <w:proofErr w:type="spellEnd"/>
-      <w:r>
-        <w:rPr>
-          <w:rFonts w:cs="Calibri"/>
-          <w:color w:val="000000"/>
-          <w:sz w:val="20"/>
-          <w:szCs w:val="20"/>
-          <w:lang w:val="en-US"/>
-        </w:rPr>
-        <w:t xml:space="preserve"> </w:t>
-      </w:r>
-      <w:proofErr w:type="spellStart"/>
-      <w:r>
-        <w:rPr>
-          <w:rFonts w:cs="Calibri"/>
-          <w:color w:val="000000"/>
-          <w:sz w:val="20"/>
-          <w:szCs w:val="20"/>
-          <w:lang w:val="en-US"/>
-        </w:rPr>
-        <w:t>Sepeda</w:t>
-      </w:r>
-      <w:proofErr w:type="spellEnd"/>
-      <w:r>
-        <w:rPr>
-          <w:rFonts w:cs="Calibri"/>
-          <w:color w:val="000000"/>
-          <w:sz w:val="20"/>
-          <w:szCs w:val="20"/>
-          <w:lang w:val="en-US"/>
-        </w:rPr>
-        <w:t xml:space="preserve"> Motor </w:t>
-      </w:r>
-      <w:proofErr w:type="spellStart"/>
-      <w:r>
-        <w:rPr>
-          <w:rFonts w:cs="Calibri"/>
-          <w:color w:val="000000"/>
-          <w:sz w:val="20"/>
-          <w:szCs w:val="20"/>
-          <w:lang w:val="en-US"/>
-        </w:rPr>
-        <w:t>Berbasis</w:t>
-      </w:r>
-      <w:proofErr w:type="spellEnd"/>
-      <w:r>
-        <w:rPr>
-          <w:rFonts w:cs="Calibri"/>
-          <w:color w:val="000000"/>
-          <w:sz w:val="20"/>
-          <w:szCs w:val="20"/>
-          <w:lang w:val="en-US"/>
-        </w:rPr>
-        <w:t xml:space="preserve"> </w:t>
-      </w:r>
-      <w:proofErr w:type="spellStart"/>
-      <w:r>
-        <w:rPr>
-          <w:rFonts w:cs="Calibri"/>
-          <w:color w:val="000000"/>
-          <w:sz w:val="20"/>
-          <w:szCs w:val="20"/>
-          <w:lang w:val="en-US"/>
-        </w:rPr>
-        <w:t>Prosesor</w:t>
-      </w:r>
-      <w:proofErr w:type="spellEnd"/>
-      <w:r>
-        <w:rPr>
-          <w:rFonts w:cs="Calibri"/>
-          <w:color w:val="000000"/>
-          <w:sz w:val="20"/>
-          <w:szCs w:val="20"/>
-          <w:lang w:val="en-US"/>
-        </w:rPr>
-        <w:t xml:space="preserve"> </w:t>
-      </w:r>
-      <w:proofErr w:type="spellStart"/>
-      <w:r>
-        <w:rPr>
-          <w:rFonts w:cs="Calibri"/>
-          <w:color w:val="000000"/>
-          <w:sz w:val="20"/>
-          <w:szCs w:val="20"/>
-          <w:lang w:val="en-US"/>
-        </w:rPr>
-        <w:t>Xtensa</w:t>
-      </w:r>
-      <w:proofErr w:type="spellEnd"/>
-      <w:r>
-        <w:rPr>
-          <w:rFonts w:cs="Calibri"/>
-          <w:color w:val="000000"/>
-          <w:sz w:val="20"/>
-          <w:szCs w:val="20"/>
-          <w:lang w:val="en-US"/>
-        </w:rPr>
-        <w:t xml:space="preserve"> LX6</w:t>
+      <w:r>
+        <w:rPr>
+          <w:rFonts w:cs="Calibri"/>
+          <w:color w:val="000000"/>
+          <w:sz w:val="20"/>
+          <w:szCs w:val="20"/>
+          <w:lang w:val="en-US"/>
+        </w:rPr>
+        <w:t>Xtensa LX6</w:t>
       </w:r>
     </w:p>
     <w:tbl>
@@ -1050,29 +936,27 @@
           <w:szCs w:val="20"/>
           <w:lang w:val="en-US"/>
         </w:rPr>
-        <w:t xml:space="preserve">,          </w:t>
-      </w:r>
-      <w:proofErr w:type="spellStart"/>
-      <w:r>
-        <w:rPr>
-          <w:rFonts w:cs="Calibri"/>
-          <w:color w:val="000000"/>
-          <w:sz w:val="20"/>
-          <w:szCs w:val="20"/>
-          <w:lang w:val="en-US"/>
-        </w:rPr>
-        <w:t>Juni</w:t>
-      </w:r>
-      <w:proofErr w:type="spellEnd"/>
-      <w:r>
-        <w:rPr>
-          <w:rFonts w:cs="Calibri"/>
-          <w:color w:val="000000"/>
-          <w:sz w:val="20"/>
-          <w:szCs w:val="20"/>
-          <w:lang w:val="en-US"/>
-        </w:rPr>
-        <w:t xml:space="preserve"> 2020</w:t>
+        <w:t>,</w:t>
+      </w:r>
+      <w:r>
+        <w:rPr>
+          <w:rFonts w:cs="Calibri"/>
+          <w:color w:val="000000"/>
+          <w:sz w:val="20"/>
+          <w:szCs w:val="20"/>
+          <w:lang w:val="en-US"/>
+        </w:rPr>
+        <w:t xml:space="preserve">      </w:t>
+      </w:r>
+      <w:r>
+        <w:rPr>
+          <w:rFonts w:cs="Calibri"/>
+          <w:color w:val="000000"/>
+          <w:sz w:val="20"/>
+          <w:szCs w:val="20"/>
+          <w:lang w:val="en-US"/>
+        </w:rPr>
+        <w:t>Juni 2020</w:t>
       </w:r>
     </w:p>
     <w:p>
@@ -1199,6 +1083,14 @@
         <w:tab/>
         <w:t xml:space="preserve">: </w:t>
       </w:r>
+      <w:r>
+        <w:rPr>
+          <w:rFonts w:cs="Calibri"/>
+          <w:color w:val="000000"/>
+          <w:lang w:val="en-US"/>
+        </w:rPr>
+        <w:t>Dr. Alex Wenda, S.T., M.Eng.,</w:t>
+      </w:r>
     </w:p>
     <w:p>
       <w:pPr>
@@ -1245,6 +1137,14 @@
         <w:tab/>
         <w:t xml:space="preserve">: </w:t>
       </w:r>
+      <w:r>
+        <w:rPr>
+          <w:rFonts w:cs="Calibri"/>
+          <w:color w:val="000000"/>
+          <w:lang w:val="en-US"/>
+        </w:rPr>
+        <w:t>Abdillah,S.Si.,M.T</w:t>
+      </w:r>
     </w:p>
     <w:p>
       <w:pPr>
@@ -1287,71 +1187,15 @@
         <w:tab/>
         <w:t xml:space="preserve">: </w:t>
       </w:r>
-      <w:proofErr w:type="spellStart"/>
-      <w:r>
-        <w:rPr>
-          <w:rFonts w:cs="Calibri"/>
-          <w:color w:val="000000"/>
-          <w:sz w:val="20"/>
-          <w:szCs w:val="20"/>
-          <w:lang w:val="en-US"/>
-        </w:rPr>
-        <w:t>Oktaf</w:t>
-      </w:r>
-      <w:proofErr w:type="spellEnd"/>
-      <w:r>
-        <w:rPr>
-          <w:rFonts w:cs="Calibri"/>
-          <w:color w:val="000000"/>
-          <w:sz w:val="20"/>
-          <w:szCs w:val="20"/>
-          <w:lang w:val="en-US"/>
-        </w:rPr>
-        <w:t xml:space="preserve"> </w:t>
-      </w:r>
-      <w:proofErr w:type="spellStart"/>
-      <w:r>
-        <w:rPr>
-          <w:rFonts w:cs="Calibri"/>
-          <w:color w:val="000000"/>
-          <w:sz w:val="20"/>
-          <w:szCs w:val="20"/>
-          <w:lang w:val="en-US"/>
-        </w:rPr>
-        <w:t>Brillian</w:t>
-      </w:r>
-      <w:proofErr w:type="spellEnd"/>
-      <w:r>
-        <w:rPr>
-          <w:rFonts w:cs="Calibri"/>
-          <w:color w:val="000000"/>
-          <w:sz w:val="20"/>
-          <w:szCs w:val="20"/>
-          <w:lang w:val="en-US"/>
-        </w:rPr>
-        <w:t xml:space="preserve"> </w:t>
-      </w:r>
-      <w:proofErr w:type="spellStart"/>
-      <w:r>
-        <w:rPr>
-          <w:rFonts w:cs="Calibri"/>
-          <w:color w:val="000000"/>
-          <w:sz w:val="20"/>
-          <w:szCs w:val="20"/>
-          <w:lang w:val="en-US"/>
-        </w:rPr>
-        <w:t>Kharisma</w:t>
-      </w:r>
-      <w:proofErr w:type="spellEnd"/>
-      <w:r>
-        <w:rPr>
-          <w:rFonts w:cs="Calibri"/>
-          <w:color w:val="000000"/>
-          <w:sz w:val="20"/>
-          <w:szCs w:val="20"/>
-          <w:lang w:val="en-US"/>
-        </w:rPr>
-        <w:t>, ST., MT.</w:t>
+      <w:r>
+        <w:rPr>
+          <w:rFonts w:cs="Calibri"/>
+          <w:color w:val="000000"/>
+          <w:sz w:val="20"/>
+          <w:szCs w:val="20"/>
+          <w:lang w:val="en-US"/>
+        </w:rPr>
+        <w:t>Oktaf Brillian Kharisma, ST., MT.</w:t>
       </w:r>
     </w:p>
     <w:p/>

</xml_diff>